<commit_message>
Auto-generate docs and exports [Quarto]
</commit_message>
<xml_diff>
--- a/exports/quarto/docx/00_ControlPlaneArchitecture.docx
+++ b/exports/quarto/docx/00_ControlPlaneArchitecture.docx
@@ -23,7 +23,7 @@
         <w:pStyle w:val="Date"/>
       </w:pPr>
       <w:r>
-        <w:t xml:space="preserve">March 31, 2026</w:t>
+        <w:t xml:space="preserve">April 2, 2026</w:t>
       </w:r>
     </w:p>
     <w:sdt>
@@ -52,7 +52,7 @@
         </w:p>
       </w:sdtContent>
     </w:sdt>
-    <w:bookmarkStart w:id="55" w:name="X89d27089b9e35464a3fe4ccca1d49cbbcbaeb69"/>
+    <w:bookmarkStart w:id="56" w:name="X89d27089b9e35464a3fe4ccca1d49cbbcbaeb69"/>
     <w:p>
       <w:pPr>
         <w:pStyle w:val="Heading1"/>
@@ -623,7 +623,7 @@
       </w:r>
     </w:p>
     <w:bookmarkEnd w:id="25"/>
-    <w:bookmarkStart w:id="26" w:name="core-concepts"/>
+    <w:bookmarkStart w:id="27" w:name="core-concepts"/>
     <w:p>
       <w:pPr>
         <w:pStyle w:val="Heading2"/>
@@ -637,7 +637,67 @@
         <w:pStyle w:val="FirstParagraph"/>
       </w:pPr>
       <w:r>
-        <w:t xml:space="preserve">The six control planes operate according to the Seven Core Concepts of UIAO:</w:t>
+        <w:t xml:space="preserve">The eight core principles governing UIAO are defined in a single source-of-truth document:</w:t>
+      </w:r>
+    </w:p>
+    <w:p>
+      <w:pPr>
+        <w:pStyle w:val="BlockText"/>
+      </w:pPr>
+      <w:r>
+        <w:rPr>
+          <w:b/>
+          <w:bCs/>
+        </w:rPr>
+        <w:t xml:space="preserve">Canonical reference:</w:t>
+      </w:r>
+      <w:r>
+        <w:t xml:space="preserve"> </w:t>
+      </w:r>
+      <w:hyperlink r:id="rId26">
+        <w:r>
+          <w:rPr>
+            <w:rStyle w:val="Hyperlink"/>
+          </w:rPr>
+          <w:t xml:space="preserve">00_CorePrinciples.md</w:t>
+        </w:r>
+      </w:hyperlink>
+    </w:p>
+    <w:p>
+      <w:pPr>
+        <w:pStyle w:val="FirstParagraph"/>
+      </w:pPr>
+      <w:r>
+        <w:t xml:space="preserve">All UIAO documents MUST reference that file rather than duplicating principle text.</w:t>
+      </w:r>
+      <w:r>
+        <w:t xml:space="preserve"> </w:t>
+      </w:r>
+      <w:r>
+        <w:t xml:space="preserve">Any expansion, amendment, or reordering of the principles MUST occur in</w:t>
+      </w:r>
+      <w:r>
+        <w:t xml:space="preserve"> </w:t>
+      </w:r>
+      <w:r>
+        <w:rPr>
+          <w:rStyle w:val="VerbatimChar"/>
+        </w:rPr>
+        <w:t xml:space="preserve">00_CorePrinciples.md</w:t>
+      </w:r>
+      <w:r>
+        <w:t xml:space="preserve"> </w:t>
+      </w:r>
+      <w:r>
+        <w:t xml:space="preserve">first; downstream documents inherit by pointer.</w:t>
+      </w:r>
+    </w:p>
+    <w:p>
+      <w:pPr>
+        <w:pStyle w:val="BodyText"/>
+      </w:pPr>
+      <w:r>
+        <w:t xml:space="preserve">For quick orientation the eight principles are:</w:t>
       </w:r>
     </w:p>
     <w:p>
@@ -649,7 +709,7 @@
         </w:numPr>
       </w:pPr>
       <w:r>
-        <w:t xml:space="preserve">Conversation as the atomic unit</w:t>
+        <w:t xml:space="preserve">Single Source of Truth (SSOT)</w:t>
       </w:r>
     </w:p>
     <w:p>
@@ -661,7 +721,7 @@
         </w:numPr>
       </w:pPr>
       <w:r>
-        <w:t xml:space="preserve">Identity as the root namespace</w:t>
+        <w:t xml:space="preserve">Conversation as the Atomic Unit</w:t>
       </w:r>
     </w:p>
     <w:p>
@@ -673,7 +733,7 @@
         </w:numPr>
       </w:pPr>
       <w:r>
-        <w:t xml:space="preserve">Deterministic addressing</w:t>
+        <w:t xml:space="preserve">Identity as the Root Namespace</w:t>
       </w:r>
     </w:p>
     <w:p>
@@ -685,7 +745,7 @@
         </w:numPr>
       </w:pPr>
       <w:r>
-        <w:t xml:space="preserve">Certificate-anchored overlay</w:t>
+        <w:t xml:space="preserve">Deterministic Addressing</w:t>
       </w:r>
     </w:p>
     <w:p>
@@ -697,7 +757,7 @@
         </w:numPr>
       </w:pPr>
       <w:r>
-        <w:t xml:space="preserve">Telemetry as control</w:t>
+        <w:t xml:space="preserve">Certificate-Anchored Overlay</w:t>
       </w:r>
     </w:p>
     <w:p>
@@ -709,7 +769,7 @@
         </w:numPr>
       </w:pPr>
       <w:r>
-        <w:t xml:space="preserve">Embedded governance &amp; automation</w:t>
+        <w:t xml:space="preserve">Telemetry as Control</w:t>
       </w:r>
     </w:p>
     <w:p>
@@ -721,7 +781,19 @@
         </w:numPr>
       </w:pPr>
       <w:r>
-        <w:t xml:space="preserve">Public service first</w:t>
+        <w:t xml:space="preserve">Embedded Governance &amp; Automation</w:t>
+      </w:r>
+    </w:p>
+    <w:p>
+      <w:pPr>
+        <w:pStyle w:val="Compact"/>
+        <w:numPr>
+          <w:ilvl w:val="0"/>
+          <w:numId w:val="1003"/>
+        </w:numPr>
+      </w:pPr>
+      <w:r>
+        <w:t xml:space="preserve">Public Service First</w:t>
       </w:r>
     </w:p>
     <w:p>
@@ -729,7 +801,22 @@
         <w:pStyle w:val="FirstParagraph"/>
       </w:pPr>
       <w:r>
-        <w:t xml:space="preserve">These concepts are frozen and must appear identically across all UIAO documents.</w:t>
+        <w:t xml:space="preserve">See</w:t>
+      </w:r>
+      <w:r>
+        <w:t xml:space="preserve"> </w:t>
+      </w:r>
+      <w:r>
+        <w:rPr>
+          <w:rStyle w:val="VerbatimChar"/>
+        </w:rPr>
+        <w:t xml:space="preserve">00_CorePrinciples.md</w:t>
+      </w:r>
+      <w:r>
+        <w:t xml:space="preserve"> </w:t>
+      </w:r>
+      <w:r>
+        <w:t xml:space="preserve">for full definitions, rationale, and compliance anchors.</w:t>
       </w:r>
     </w:p>
     <w:p>
@@ -739,8 +826,8 @@
         </w:pict>
       </w:r>
     </w:p>
-    <w:bookmarkEnd w:id="26"/>
-    <w:bookmarkStart w:id="35" w:name="architecture-model"/>
+    <w:bookmarkEnd w:id="27"/>
+    <w:bookmarkStart w:id="36" w:name="architecture-model"/>
     <w:p>
       <w:pPr>
         <w:pStyle w:val="Heading2"/>
@@ -749,7 +836,7 @@
         <w:t xml:space="preserve">1.6 6. Architecture Model</w:t>
       </w:r>
     </w:p>
-    <w:bookmarkStart w:id="27" w:name="overview"/>
+    <w:bookmarkStart w:id="28" w:name="overview"/>
     <w:p>
       <w:pPr>
         <w:pStyle w:val="Heading3"/>
@@ -766,8 +853,8 @@
         <w:t xml:space="preserve">The UIAO architecture replaces legacy perimeter-centric models with a federated, identity-driven, telemetry-informed control plane system. Each plane is authoritative for a specific domain but interoperates through deterministic, identity-anchored relationships.</w:t>
       </w:r>
     </w:p>
-    <w:bookmarkEnd w:id="27"/>
-    <w:bookmarkStart w:id="34" w:name="plane-definitions"/>
+    <w:bookmarkEnd w:id="28"/>
+    <w:bookmarkStart w:id="35" w:name="plane-definitions"/>
     <w:p>
       <w:pPr>
         <w:pStyle w:val="Heading3"/>
@@ -776,7 +863,7 @@
         <w:t xml:space="preserve">1.6.2 6.2 Plane Definitions</w:t>
       </w:r>
     </w:p>
-    <w:bookmarkStart w:id="28" w:name="identity-control-plane"/>
+    <w:bookmarkStart w:id="29" w:name="identity-control-plane"/>
     <w:p>
       <w:pPr>
         <w:pStyle w:val="Heading4"/>
@@ -939,8 +1026,8 @@
         <w:t xml:space="preserve">Tokens, claims, identity attributes, assurance signals</w:t>
       </w:r>
     </w:p>
-    <w:bookmarkEnd w:id="28"/>
-    <w:bookmarkStart w:id="29" w:name="network-control-plane"/>
+    <w:bookmarkEnd w:id="29"/>
+    <w:bookmarkStart w:id="30" w:name="network-control-plane"/>
     <w:p>
       <w:pPr>
         <w:pStyle w:val="Heading4"/>
@@ -1091,8 +1178,8 @@
         <w:t xml:space="preserve">Segmentation decisions, path selection, overlay tunnels</w:t>
       </w:r>
     </w:p>
-    <w:bookmarkEnd w:id="29"/>
-    <w:bookmarkStart w:id="30" w:name="addressing-control-plane"/>
+    <w:bookmarkEnd w:id="30"/>
+    <w:bookmarkStart w:id="31" w:name="addressing-control-plane"/>
     <w:p>
       <w:pPr>
         <w:pStyle w:val="Heading4"/>
@@ -1243,8 +1330,8 @@
         <w:t xml:space="preserve">IP allocations, DNS records, DHCP leases</w:t>
       </w:r>
     </w:p>
-    <w:bookmarkEnd w:id="30"/>
-    <w:bookmarkStart w:id="31" w:name="telemetry-location-control-plane"/>
+    <w:bookmarkEnd w:id="31"/>
+    <w:bookmarkStart w:id="32" w:name="telemetry-location-control-plane"/>
     <w:p>
       <w:pPr>
         <w:pStyle w:val="Heading4"/>
@@ -1395,8 +1482,8 @@
         <w:t xml:space="preserve">Assurance signals, routing modifiers, compliance indicators</w:t>
       </w:r>
     </w:p>
-    <w:bookmarkEnd w:id="31"/>
-    <w:bookmarkStart w:id="32" w:name="security-compliance-plane"/>
+    <w:bookmarkEnd w:id="32"/>
+    <w:bookmarkStart w:id="33" w:name="security-compliance-plane"/>
     <w:p>
       <w:pPr>
         <w:pStyle w:val="Heading4"/>
@@ -1535,8 +1622,8 @@
         <w:t xml:space="preserve">Allow/deny decisions, audit artifacts, compliance posture</w:t>
       </w:r>
     </w:p>
-    <w:bookmarkEnd w:id="32"/>
-    <w:bookmarkStart w:id="33" w:name="management-plane"/>
+    <w:bookmarkEnd w:id="33"/>
+    <w:bookmarkStart w:id="34" w:name="management-plane"/>
     <w:p>
       <w:pPr>
         <w:pStyle w:val="Heading4"/>
@@ -1694,10 +1781,10 @@
         </w:pict>
       </w:r>
     </w:p>
-    <w:bookmarkEnd w:id="33"/>
     <w:bookmarkEnd w:id="34"/>
     <w:bookmarkEnd w:id="35"/>
-    <w:bookmarkStart w:id="39" w:name="runtime-model"/>
+    <w:bookmarkEnd w:id="36"/>
+    <w:bookmarkStart w:id="40" w:name="runtime-model"/>
     <w:p>
       <w:pPr>
         <w:pStyle w:val="Heading2"/>
@@ -1714,7 +1801,7 @@
         <w:t xml:space="preserve">UIAO operates on conversations as the atomic unit.</w:t>
       </w:r>
     </w:p>
-    <w:bookmarkStart w:id="36" w:name="conversation-flow"/>
+    <w:bookmarkStart w:id="37" w:name="conversation-flow"/>
     <w:p>
       <w:pPr>
         <w:pStyle w:val="Heading3"/>
@@ -1795,8 +1882,8 @@
         <w:t xml:space="preserve">Policy evaluates continuously</w:t>
       </w:r>
     </w:p>
-    <w:bookmarkEnd w:id="36"/>
-    <w:bookmarkStart w:id="37" w:name="determinism"/>
+    <w:bookmarkEnd w:id="37"/>
+    <w:bookmarkStart w:id="38" w:name="determinism"/>
     <w:p>
       <w:pPr>
         <w:pStyle w:val="Heading3"/>
@@ -1813,8 +1900,8 @@
         <w:t xml:space="preserve">Given identical identity, boundary, telemetry, and assurance inputs, the system must produce the same decision across clouds, agencies, and implementations.</w:t>
       </w:r>
     </w:p>
-    <w:bookmarkEnd w:id="37"/>
-    <w:bookmarkStart w:id="38" w:name="continuous-evaluation"/>
+    <w:bookmarkEnd w:id="38"/>
+    <w:bookmarkStart w:id="39" w:name="continuous-evaluation"/>
     <w:p>
       <w:pPr>
         <w:pStyle w:val="Heading3"/>
@@ -1838,9 +1925,9 @@
         </w:pict>
       </w:r>
     </w:p>
-    <w:bookmarkEnd w:id="38"/>
     <w:bookmarkEnd w:id="39"/>
-    <w:bookmarkStart w:id="43" w:name="compliance-mapping"/>
+    <w:bookmarkEnd w:id="40"/>
+    <w:bookmarkStart w:id="44" w:name="compliance-mapping"/>
     <w:p>
       <w:pPr>
         <w:pStyle w:val="Heading2"/>
@@ -1849,7 +1936,7 @@
         <w:t xml:space="preserve">1.8 8. Compliance Mapping</w:t>
       </w:r>
     </w:p>
-    <w:bookmarkStart w:id="40" w:name="fedramp-20x-alignment"/>
+    <w:bookmarkStart w:id="41" w:name="fedramp-20x-alignment"/>
     <w:p>
       <w:pPr>
         <w:pStyle w:val="Heading3"/>
@@ -1894,8 +1981,8 @@
         <w:t xml:space="preserve">OSCAL machine-readability</w:t>
       </w:r>
     </w:p>
-    <w:bookmarkEnd w:id="40"/>
-    <w:bookmarkStart w:id="41" w:name="nist-800-53-rev-5-controls"/>
+    <w:bookmarkEnd w:id="41"/>
+    <w:bookmarkStart w:id="42" w:name="nist-800-53-rev-5-controls"/>
     <w:p>
       <w:pPr>
         <w:pStyle w:val="Heading3"/>
@@ -2118,8 +2205,8 @@
         </w:tc>
       </w:tr>
     </w:tbl>
-    <w:bookmarkEnd w:id="41"/>
-    <w:bookmarkStart w:id="42" w:name="ksi-categories"/>
+    <w:bookmarkEnd w:id="42"/>
+    <w:bookmarkStart w:id="43" w:name="ksi-categories"/>
     <w:p>
       <w:pPr>
         <w:pStyle w:val="Heading3"/>
@@ -2219,9 +2306,9 @@
         </w:pict>
       </w:r>
     </w:p>
-    <w:bookmarkEnd w:id="42"/>
     <w:bookmarkEnd w:id="43"/>
-    <w:bookmarkStart w:id="46" w:name="dependencies-sequencing"/>
+    <w:bookmarkEnd w:id="44"/>
+    <w:bookmarkStart w:id="47" w:name="dependencies-sequencing"/>
     <w:p>
       <w:pPr>
         <w:pStyle w:val="Heading2"/>
@@ -2230,7 +2317,7 @@
         <w:t xml:space="preserve">1.9 9. Dependencies &amp; Sequencing</w:t>
       </w:r>
     </w:p>
-    <w:bookmarkStart w:id="44" w:name="upstream"/>
+    <w:bookmarkStart w:id="45" w:name="upstream"/>
     <w:p>
       <w:pPr>
         <w:pStyle w:val="Heading3"/>
@@ -2287,8 +2374,8 @@
         <w:t xml:space="preserve">Network underlay</w:t>
       </w:r>
     </w:p>
-    <w:bookmarkEnd w:id="44"/>
-    <w:bookmarkStart w:id="45" w:name="downstream"/>
+    <w:bookmarkEnd w:id="45"/>
+    <w:bookmarkStart w:id="46" w:name="downstream"/>
     <w:p>
       <w:pPr>
         <w:pStyle w:val="Heading3"/>
@@ -2352,9 +2439,9 @@
         </w:pict>
       </w:r>
     </w:p>
-    <w:bookmarkEnd w:id="45"/>
     <w:bookmarkEnd w:id="46"/>
-    <w:bookmarkStart w:id="47" w:name="governance-drift-controls"/>
+    <w:bookmarkEnd w:id="47"/>
+    <w:bookmarkStart w:id="48" w:name="governance-drift-controls"/>
     <w:p>
       <w:pPr>
         <w:pStyle w:val="Heading2"/>
@@ -2505,8 +2592,8 @@
         </w:pict>
       </w:r>
     </w:p>
-    <w:bookmarkEnd w:id="47"/>
-    <w:bookmarkStart w:id="53" w:name="appendices"/>
+    <w:bookmarkEnd w:id="48"/>
+    <w:bookmarkStart w:id="54" w:name="appendices"/>
     <w:p>
       <w:pPr>
         <w:pStyle w:val="Heading2"/>
@@ -2515,7 +2602,7 @@
         <w:t xml:space="preserve">1.11 11. Appendices</w:t>
       </w:r>
     </w:p>
-    <w:bookmarkStart w:id="48" w:name="appendix-a-definitions"/>
+    <w:bookmarkStart w:id="49" w:name="appendix-a-definitions"/>
     <w:p>
       <w:pPr>
         <w:pStyle w:val="Heading3"/>
@@ -2551,8 +2638,8 @@
         <w:t xml:space="preserve">docs/glossary.md</w:t>
       </w:r>
     </w:p>
-    <w:bookmarkEnd w:id="48"/>
-    <w:bookmarkStart w:id="49" w:name="appendix-b-tables"/>
+    <w:bookmarkEnd w:id="49"/>
+    <w:bookmarkStart w:id="50" w:name="appendix-b-tables"/>
     <w:p>
       <w:pPr>
         <w:pStyle w:val="Heading3"/>
@@ -2573,8 +2660,8 @@
         <w:t xml:space="preserve">Control plane summary tables are embedded in Section 4 and Section 6.</w:t>
       </w:r>
     </w:p>
-    <w:bookmarkEnd w:id="49"/>
-    <w:bookmarkStart w:id="50" w:name="appendix-c-diagram-references"/>
+    <w:bookmarkEnd w:id="50"/>
+    <w:bookmarkStart w:id="51" w:name="appendix-c-diagram-references"/>
     <w:p>
       <w:pPr>
         <w:pStyle w:val="Heading3"/>
@@ -2624,8 +2711,8 @@
         <w:t xml:space="preserve">for all referenced architecture diagrams.</w:t>
       </w:r>
     </w:p>
-    <w:bookmarkEnd w:id="50"/>
-    <w:bookmarkStart w:id="51" w:name="appendix-d-crosswalk-references"/>
+    <w:bookmarkEnd w:id="51"/>
+    <w:bookmarkStart w:id="52" w:name="appendix-d-crosswalk-references"/>
     <w:p>
       <w:pPr>
         <w:pStyle w:val="Heading3"/>
@@ -2697,8 +2784,8 @@
         <w:t xml:space="preserve">.</w:t>
       </w:r>
     </w:p>
-    <w:bookmarkEnd w:id="51"/>
-    <w:bookmarkStart w:id="52" w:name="appendix-e-evidence-sources"/>
+    <w:bookmarkEnd w:id="52"/>
+    <w:bookmarkStart w:id="53" w:name="appendix-e-evidence-sources"/>
     <w:p>
       <w:pPr>
         <w:pStyle w:val="Heading3"/>
@@ -2755,9 +2842,9 @@
         </w:pict>
       </w:r>
     </w:p>
-    <w:bookmarkEnd w:id="52"/>
     <w:bookmarkEnd w:id="53"/>
-    <w:bookmarkStart w:id="54" w:name="revision-history"/>
+    <w:bookmarkEnd w:id="54"/>
+    <w:bookmarkStart w:id="55" w:name="revision-history"/>
     <w:p>
       <w:pPr>
         <w:pStyle w:val="Heading2"/>
@@ -2874,8 +2961,8 @@
         </w:tc>
       </w:tr>
     </w:tbl>
-    <w:bookmarkEnd w:id="54"/>
     <w:bookmarkEnd w:id="55"/>
+    <w:bookmarkEnd w:id="56"/>
     <w:sectPr/>
   </w:body>
 </w:document>

</xml_diff>